<commit_message>
Work in progress: Veyan rebrand, L1→L9 order, Mermaid diagrams for all chapter flows, LinkedIn Post 0 and post visuals, master de-duplicated
- 34 ASCII flows in the chapters converted to editable Mermaid sources in 08_Graphic/diagrams/
- LinkedIn introduction post (Post 0) and visual renderer (tools/render_post_visuals.js); visuals in 08_Graphic/linkedin/
- Master: LinkedIn series and tile-by-tile annex removed (one home each); IV.1 states the model, XII.5 maps it to the popular stack diagram
- Deliverables are rebuilt in the next commit

Co-Authored-By: Claude Opus 5.5 <noreply@anthropic.com>
Claude-Session: https://claude.ai/code/session_01GYt6k15P64MhHqeyveeQ6D
</commit_message>
<xml_diff>
--- a/tools/templates/reference.docx
+++ b/tools/templates/reference.docx
@@ -382,7 +382,10 @@
 </w:t>
       </w:r>
     </w:p>
-    <w:sectPr/>
+    <w:sectPr>
+      <w:headerReference w:type="default" r:id="rId9"/>
+      <w:footerReference w:type="default" r:id="rId10"/>
+    </w:sectPr>
   </w:body>
 </w:document>
 </file>
@@ -391,6 +394,57 @@
 <w:comments xmlns:w="http://schemas.openxmlformats.org/wordprocessingml/2006/main" xmlns:m="http://schemas.openxmlformats.org/officeDocument/2006/math" xmlns:r="http://schemas.openxmlformats.org/officeDocument/2006/relationships" xmlns:o="urn:schemas-microsoft-com:office:office" xmlns:v="urn:schemas-microsoft-com:vml" xmlns:w10="urn:schemas-microsoft-com:office:word" xmlns:a="http://schemas.openxmlformats.org/drawingml/2006/main" xmlns:pic="http://schemas.openxmlformats.org/drawingml/2006/picture" xmlns:wp="http://schemas.openxmlformats.org/drawingml/2006/wordprocessingDrawing"/>
 </file>
 
+<file path=word/footer1.xml><?xml version="1.0" encoding="utf-8"?>
+<w:ftr xmlns:m="http://schemas.openxmlformats.org/officeDocument/2006/math" xmlns:mc="http://schemas.openxmlformats.org/markup-compatibility/2006" xmlns:mo="http://schemas.microsoft.com/office/mac/office/2008/main" xmlns:mv="urn:schemas-microsoft-com:mac:vml" xmlns:o="urn:schemas-microsoft-com:office:office" xmlns:r="http://schemas.openxmlformats.org/officeDocument/2006/relationships" xmlns:v="urn:schemas-microsoft-com:vml" xmlns:w10="urn:schemas-microsoft-com:office:word" xmlns:w14="http://schemas.microsoft.com/office/word/2010/wordml" xmlns:w="http://schemas.openxmlformats.org/wordprocessingml/2006/main" xmlns:wne="http://schemas.microsoft.com/office/word/2006/wordml" xmlns:wp14="http://schemas.microsoft.com/office/word/2010/wordprocessingDrawing" xmlns:wp="http://schemas.openxmlformats.org/drawingml/2006/wordprocessingDrawing" xmlns:wpc="http://schemas.microsoft.com/office/word/2010/wordprocessingCanvas" xmlns:wpg="http://schemas.microsoft.com/office/word/2010/wordprocessingGroup" xmlns:wpi="http://schemas.microsoft.com/office/word/2010/wordprocessingInk" xmlns:wps="http://schemas.microsoft.com/office/word/2010/wordprocessingShape" mc:Ignorable="w14 wp14">
+  <w:p>
+    <w:pPr>
+      <w:jc w:val="left"/>
+    </w:pPr>
+    <w:r>
+      <w:drawing>
+        <wp:inline xmlns:a="http://schemas.openxmlformats.org/drawingml/2006/main" xmlns:pic="http://schemas.openxmlformats.org/drawingml/2006/picture">
+          <wp:extent cx="182880" cy="182880"/>
+          <wp:docPr id="1" name="Picture 1"/>
+          <wp:cNvGraphicFramePr>
+            <a:graphicFrameLocks noChangeAspect="1"/>
+          </wp:cNvGraphicFramePr>
+          <a:graphic>
+            <a:graphicData uri="http://schemas.openxmlformats.org/drawingml/2006/picture">
+              <pic:pic>
+                <pic:nvPicPr>
+                  <pic:cNvPr id="0" name="veyan_mark.png"/>
+                  <pic:cNvPicPr/>
+                </pic:nvPicPr>
+                <pic:blipFill>
+                  <a:blip r:embed="rId1"/>
+                  <a:stretch>
+                    <a:fillRect/>
+                  </a:stretch>
+                </pic:blipFill>
+                <pic:spPr>
+                  <a:xfrm>
+                    <a:off x="0" y="0"/>
+                    <a:ext cx="182880" cy="182880"/>
+                  </a:xfrm>
+                  <a:prstGeom prst="rect"/>
+                </pic:spPr>
+              </pic:pic>
+            </a:graphicData>
+          </a:graphic>
+        </wp:inline>
+      </w:drawing>
+    </w:r>
+    <w:r>
+      <w:rPr>
+        <w:color w:val="6B7A8F"/>
+        <w:sz w:val="15"/>
+      </w:rPr>
+      <w:t xml:space="preserve">   Veyan · The Enterprise GenAI Stack · the view at end of Q3 2026 · not a description of any firm's platform</w:t>
+    </w:r>
+  </w:p>
+</w:ftr>
+</file>
+
 <file path=word/footnotes.xml><?xml version="1.0" encoding="utf-8"?>
 <w:footnotes xmlns:w="http://schemas.openxmlformats.org/wordprocessingml/2006/main" xmlns:m="http://schemas.openxmlformats.org/officeDocument/2006/math" xmlns:r="http://schemas.openxmlformats.org/officeDocument/2006/relationships" xmlns:o="urn:schemas-microsoft-com:office:office" xmlns:v="urn:schemas-microsoft-com:vml" xmlns:w10="urn:schemas-microsoft-com:office:word" xmlns:a="http://schemas.openxmlformats.org/drawingml/2006/main" xmlns:pic="http://schemas.openxmlformats.org/drawingml/2006/picture" xmlns:wp="http://schemas.openxmlformats.org/drawingml/2006/wordprocessingDrawing">
   <w:footnote w:type="continuationSeparator" w:id="0">
@@ -427,6 +481,53 @@
     </w:p>
   </w:footnote>
 </w:footnotes>
+</file>
+
+<file path=word/header1.xml><?xml version="1.0" encoding="utf-8"?>
+<w:hdr xmlns:m="http://schemas.openxmlformats.org/officeDocument/2006/math" xmlns:mc="http://schemas.openxmlformats.org/markup-compatibility/2006" xmlns:mo="http://schemas.microsoft.com/office/mac/office/2008/main" xmlns:mv="urn:schemas-microsoft-com:mac:vml" xmlns:o="urn:schemas-microsoft-com:office:office" xmlns:r="http://schemas.openxmlformats.org/officeDocument/2006/relationships" xmlns:v="urn:schemas-microsoft-com:vml" xmlns:w10="urn:schemas-microsoft-com:office:word" xmlns:w14="http://schemas.microsoft.com/office/word/2010/wordml" xmlns:w="http://schemas.openxmlformats.org/wordprocessingml/2006/main" xmlns:wne="http://schemas.microsoft.com/office/word/2006/wordml" xmlns:wp14="http://schemas.microsoft.com/office/word/2010/wordprocessingDrawing" xmlns:wp="http://schemas.openxmlformats.org/drawingml/2006/wordprocessingDrawing" xmlns:wpc="http://schemas.microsoft.com/office/word/2010/wordprocessingCanvas" xmlns:wpg="http://schemas.microsoft.com/office/word/2010/wordprocessingGroup" xmlns:wpi="http://schemas.microsoft.com/office/word/2010/wordprocessingInk" xmlns:wps="http://schemas.microsoft.com/office/word/2010/wordprocessingShape" mc:Ignorable="w14 wp14">
+  <w:p>
+    <w:pPr>
+      <w:jc w:val="right"/>
+      <w:pBdr>
+        <w:bottom w:val="single" w:sz="12" w:space="4" w:color="D4A13A"/>
+      </w:pBdr>
+    </w:pPr>
+    <w:r>
+      <w:drawing>
+        <wp:inline xmlns:a="http://schemas.openxmlformats.org/drawingml/2006/main" xmlns:pic="http://schemas.openxmlformats.org/drawingml/2006/picture">
+          <wp:extent cx="1325880" cy="383572"/>
+          <wp:docPr id="1" name="Picture 1"/>
+          <wp:cNvGraphicFramePr>
+            <a:graphicFrameLocks noChangeAspect="1"/>
+          </wp:cNvGraphicFramePr>
+          <a:graphic>
+            <a:graphicData uri="http://schemas.openxmlformats.org/drawingml/2006/picture">
+              <pic:pic>
+                <pic:nvPicPr>
+                  <pic:cNvPr id="0" name="veyan_lockup.png"/>
+                  <pic:cNvPicPr/>
+                </pic:nvPicPr>
+                <pic:blipFill>
+                  <a:blip r:embed="rId1"/>
+                  <a:stretch>
+                    <a:fillRect/>
+                  </a:stretch>
+                </pic:blipFill>
+                <pic:spPr>
+                  <a:xfrm>
+                    <a:off x="0" y="0"/>
+                    <a:ext cx="1325880" cy="383572"/>
+                  </a:xfrm>
+                  <a:prstGeom prst="rect"/>
+                </pic:spPr>
+              </pic:pic>
+            </a:graphicData>
+          </a:graphic>
+        </wp:inline>
+      </w:drawing>
+    </w:r>
+  </w:p>
+</w:hdr>
 </file>
 
 <file path=word/numbering.xml><?xml version="1.0" encoding="utf-8"?>
@@ -613,10 +714,10 @@
       <w:jc w:val="center"/>
     </w:pPr>
     <w:rPr>
-      <w:rFonts w:asciiTheme="majorHAnsi" w:eastAsiaTheme="majorEastAsia" w:hAnsiTheme="majorHAnsi" w:cstheme="majorBidi"/>
+      <w:rFonts w:asciiTheme="majorHAnsi" w:eastAsiaTheme="majorEastAsia" w:hAnsiTheme="majorHAnsi" w:cstheme="majorBidi" w:ascii="Arial" w:hAnsi="Arial"/>
       <w:b/>
       <w:bCs/>
-      <w:color w:val="1F3864"/>
+      <w:color w:val="0B1B33"/>
       <w:sz w:val="56"/>
       <w:szCs w:val="36"/>
     </w:rPr>
@@ -633,6 +734,7 @@
       <w:jc w:val="center"/>
     </w:pPr>
     <w:rPr>
+      <w:color w:val="2E6DA4"/>
       <w:sz w:val="30"/>
       <w:szCs w:val="30"/>
     </w:rPr>
@@ -712,54 +814,54 @@
       <w:outlineLvl w:val="0"/>
     </w:pPr>
     <w:rPr>
+      <w:rFonts w:asciiTheme="majorHAnsi" w:eastAsiaTheme="majorEastAsia" w:hAnsiTheme="majorHAnsi" w:cstheme="majorBidi" w:ascii="Arial" w:hAnsi="Arial"/>
+      <w:b/>
+      <w:bCs/>
+      <w:color w:val="0B1B33"/>
+      <w:sz w:val="40"/>
+      <w:szCs w:val="32"/>
+    </w:rPr>
+  </w:style>
+  <w:style w:type="paragraph" w:styleId="Heading2">
+    <w:name w:val="Heading 2"/>
+    <w:basedOn w:val="Normal"/>
+    <w:next w:val="BodyText"/>
+    <w:uiPriority w:val="9"/>
+    <w:unhideWhenUsed/>
+    <w:qFormat/>
+    <w:pPr>
+      <w:keepNext/>
+      <w:keepLines/>
+      <w:spacing w:before="200" w:after="0"/>
+      <w:outlineLvl w:val="1"/>
+    </w:pPr>
+    <w:rPr>
+      <w:rFonts w:asciiTheme="majorHAnsi" w:eastAsiaTheme="majorEastAsia" w:hAnsiTheme="majorHAnsi" w:cstheme="majorBidi" w:ascii="Arial" w:hAnsi="Arial"/>
+      <w:b/>
+      <w:bCs/>
+      <w:color w:val="0B1B33"/>
+      <w:sz w:val="32"/>
+      <w:szCs w:val="28"/>
+    </w:rPr>
+  </w:style>
+  <w:style w:type="paragraph" w:styleId="Heading3">
+    <w:name w:val="Heading 3"/>
+    <w:basedOn w:val="Normal"/>
+    <w:next w:val="BodyText"/>
+    <w:uiPriority w:val="9"/>
+    <w:unhideWhenUsed/>
+    <w:qFormat/>
+    <w:pPr>
+      <w:keepNext/>
+      <w:keepLines/>
+      <w:spacing w:before="200" w:after="0"/>
+      <w:outlineLvl w:val="2"/>
+    </w:pPr>
+    <w:rPr>
       <w:rFonts w:asciiTheme="majorHAnsi" w:eastAsiaTheme="majorEastAsia" w:hAnsiTheme="majorHAnsi" w:cstheme="majorBidi" w:ascii="Calibri" w:hAnsi="Calibri"/>
       <w:b/>
       <w:bCs/>
-      <w:color w:val="1F3864"/>
-      <w:sz w:val="40"/>
-      <w:szCs w:val="32"/>
-    </w:rPr>
-  </w:style>
-  <w:style w:type="paragraph" w:styleId="Heading2">
-    <w:name w:val="Heading 2"/>
-    <w:basedOn w:val="Normal"/>
-    <w:next w:val="BodyText"/>
-    <w:uiPriority w:val="9"/>
-    <w:unhideWhenUsed/>
-    <w:qFormat/>
-    <w:pPr>
-      <w:keepNext/>
-      <w:keepLines/>
-      <w:spacing w:before="200" w:after="0"/>
-      <w:outlineLvl w:val="1"/>
-    </w:pPr>
-    <w:rPr>
-      <w:rFonts w:asciiTheme="majorHAnsi" w:eastAsiaTheme="majorEastAsia" w:hAnsiTheme="majorHAnsi" w:cstheme="majorBidi" w:ascii="Calibri" w:hAnsi="Calibri"/>
-      <w:b/>
-      <w:bCs/>
-      <w:color w:val="1F3864"/>
-      <w:sz w:val="32"/>
-      <w:szCs w:val="28"/>
-    </w:rPr>
-  </w:style>
-  <w:style w:type="paragraph" w:styleId="Heading3">
-    <w:name w:val="Heading 3"/>
-    <w:basedOn w:val="Normal"/>
-    <w:next w:val="BodyText"/>
-    <w:uiPriority w:val="9"/>
-    <w:unhideWhenUsed/>
-    <w:qFormat/>
-    <w:pPr>
-      <w:keepNext/>
-      <w:keepLines/>
-      <w:spacing w:before="200" w:after="0"/>
-      <w:outlineLvl w:val="2"/>
-    </w:pPr>
-    <w:rPr>
-      <w:rFonts w:asciiTheme="majorHAnsi" w:eastAsiaTheme="majorEastAsia" w:hAnsiTheme="majorHAnsi" w:cstheme="majorBidi" w:ascii="Calibri" w:hAnsi="Calibri"/>
-      <w:b/>
-      <w:bCs/>
-      <w:color w:val="1F3864"/>
+      <w:color w:val="0B1B33"/>
       <w:sz w:val="26"/>
       <w:szCs w:val="24"/>
     </w:rPr>
@@ -782,7 +884,7 @@
       <w:i/>
       <w:b/>
       <w:bCs/>
-      <w:color w:val="1F3864"/>
+      <w:color w:val="0B1B33"/>
       <w:sz w:val="23"/>
       <w:szCs w:val="24"/>
     </w:rPr>
@@ -1043,7 +1145,7 @@
       <w:rFonts w:asciiTheme="majorHAnsi" w:eastAsiaTheme="majorEastAsia" w:hAnsiTheme="majorHAnsi" w:cstheme="majorBidi"/>
       <w:b w:val="0"/>
       <w:bCs w:val="0"/>
-      <w:color w:val="365F91" w:themeColor="accent1" w:themeShade="BF"/>
+      <w:color w:val="0B1B33"/>
     </w:rPr>
   </w:style>
   <w:style w:type="character" w:customStyle="1" w:styleId="ClaimLabel">

</xml_diff>